<commit_message>
Documento Word sin subtitulos dentro de los capitulos
Quitados los 18 subtitulos y la frase "un dia en la vida de un nodo"; las referencias a apartados pasan a capitulos. El indice queda solo con los capitulos.

Co-Authored-By: Claude Opus 5.5 <noreply@anthropic.com>
</commit_message>
<xml_diff>
--- a/explicacion/CHIP_FOREST_funcionamiento.docx
+++ b/explicacion/CHIP_FOREST_funcionamiento.docx
@@ -89,7 +89,7 @@
         <w:p>
           <w:r>
             <w:fldChar w:fldCharType="begin" w:dirty="true"/>
-            <w:instrText xml:space="preserve">TOC \h \o "1-2"</w:instrText>
+            <w:instrText xml:space="preserve">TOC \h \o "1-1"</w:instrText>
             <w:fldChar w:fldCharType="separate"/>
           </w:r>
         </w:p>
@@ -241,18 +241,10 @@
     </w:p>
     <w:p>
       <w:pPr>
-        <w:pStyle w:val="Heading2"/>
-      </w:pPr>
-      <w:r>
-        <w:t xml:space="preserve">2.1 El viaje de un dato</w:t>
-      </w:r>
-    </w:p>
-    <w:p>
-      <w:pPr>
-        <w:spacing w:after="120" w:line="276"/>
-      </w:pPr>
-      <w:r>
-        <w:t xml:space="preserve">Sigamos una medida de temperatura desde que se toma hasta que aparece en una gráfica.</w:t>
+        <w:spacing w:after="120" w:line="276"/>
+      </w:pPr>
+      <w:r>
+        <w:t xml:space="preserve">Para entenderlo, sigamos una medida de temperatura desde que se toma hasta que aparece en una gráfica.</w:t>
       </w:r>
     </w:p>
     <w:p>
@@ -273,18 +265,10 @@
     </w:p>
     <w:p>
       <w:pPr>
-        <w:pStyle w:val="Heading2"/>
-      </w:pPr>
-      <w:r>
-        <w:t xml:space="preserve">2.2 El viaje de una orden</w:t>
-      </w:r>
-    </w:p>
-    <w:p>
-      <w:pPr>
-        <w:spacing w:after="120" w:line="276"/>
-      </w:pPr>
-      <w:r>
-        <w:t xml:space="preserve">Ahora al revés: un operador decide, desde el servidor, subir el umbral de temperatura de un nodo.</w:t>
+        <w:spacing w:after="120" w:line="276"/>
+      </w:pPr>
+      <w:r>
+        <w:t xml:space="preserve">Las órdenes hacen el camino al revés. Supongamos que un operador decide desde el servidor subir el umbral de temperatura de un nodo.</w:t>
       </w:r>
     </w:p>
     <w:p>
@@ -981,14 +965,6 @@
     </w:p>
     <w:p>
       <w:pPr>
-        <w:pStyle w:val="Heading2"/>
-      </w:pPr>
-      <w:r>
-        <w:t xml:space="preserve">4.1 Un día en la vida de un nodo</w:t>
-      </w:r>
-    </w:p>
-    <w:p>
-      <w:pPr>
         <w:spacing w:after="120" w:line="276"/>
       </w:pPr>
       <w:r>
@@ -1025,14 +1001,6 @@
       </w:pPr>
       <w:r>
         <w:t xml:space="preserve">Y una más: cuando se enciende por primera vez (o tras un reinicio), hace una ronda completa de todos los sensores y un envío inmediato, para confirmar que todo funciona, y se queda despierto al menos 30 segundos. Así hay tiempo de conectarle un ordenador y cargarle un programa nuevo; una vez dormido, sería casi imposible pillarlo.</w:t>
-      </w:r>
-    </w:p>
-    <w:p>
-      <w:pPr>
-        <w:pStyle w:val="Heading2"/>
-      </w:pPr>
-      <w:r>
-        <w:t xml:space="preserve">4.2 El calendario: cada sensor a su ritmo</w:t>
       </w:r>
     </w:p>
     <w:p>
@@ -2016,14 +1984,6 @@
     </w:p>
     <w:p>
       <w:pPr>
-        <w:pStyle w:val="Heading2"/>
-      </w:pPr>
-      <w:r>
-        <w:t xml:space="preserve">4.3 Un sensor detrás de otro, nunca a la vez</w:t>
-      </w:r>
-    </w:p>
-    <w:p>
-      <w:pPr>
         <w:spacing w:after="120" w:line="276"/>
       </w:pPr>
       <w:r>
@@ -2144,14 +2104,6 @@
     </w:p>
     <w:p>
       <w:pPr>
-        <w:pStyle w:val="Heading2"/>
-      </w:pPr>
-      <w:r>
-        <w:t xml:space="preserve">4.4 El reloj: saber qué hora es sin tener reloj</w:t>
-      </w:r>
-    </w:p>
-    <w:p>
-      <w:pPr>
         <w:spacing w:after="120" w:line="276"/>
       </w:pPr>
       <w:r>
@@ -2180,14 +2132,6 @@
       </w:pPr>
       <w:r>
         <w:t xml:space="preserve">Un detalle práctico: las medidas que envía el nodo no llevan la hora, sino su antigüedad («esto lo medí hace 900 segundos»). Es la pasarela, que tiene la hora buena, quien las fecha.</w:t>
-      </w:r>
-    </w:p>
-    <w:p>
-      <w:pPr>
-        <w:pStyle w:val="Heading2"/>
-      </w:pPr>
-      <w:r>
-        <w:t xml:space="preserve">4.5 Hablar con la pasarela</w:t>
       </w:r>
     </w:p>
     <w:p>
@@ -2243,14 +2187,6 @@
       </w:pPr>
       <w:r>
         <w:t xml:space="preserve">La radio funciona en la banda europea de 868 MHz y con una potencia algo reducida (14 dBm) para que el pico de corriente no tumbe la placa. Cada nodo tiene su propia dirección (C1 es la 1, C2 la 3, C3 la 4; la pasarela es la 2), y todos tienen que usar exactamente los mismos ajustes de radio o no se entienden.</w:t>
-      </w:r>
-    </w:p>
-    <w:p>
-      <w:pPr>
-        <w:pStyle w:val="Heading2"/>
-      </w:pPr>
-      <w:r>
-        <w:t xml:space="preserve">4.6 Las órdenes que entiende un nodo</w:t>
       </w:r>
     </w:p>
     <w:p>
@@ -3039,14 +2975,6 @@
     </w:p>
     <w:p>
       <w:pPr>
-        <w:pStyle w:val="Heading2"/>
-      </w:pPr>
-      <w:r>
-        <w:t xml:space="preserve">5.1 Las reglas del juego</w:t>
-      </w:r>
-    </w:p>
-    <w:p>
-      <w:pPr>
         <w:spacing w:after="120" w:line="276"/>
       </w:pPr>
       <w:r>
@@ -3159,14 +3087,6 @@
     </w:p>
     <w:p>
       <w:pPr>
-        <w:pStyle w:val="Heading2"/>
-      </w:pPr>
-      <w:r>
-        <w:t xml:space="preserve">6.1 El modo seguro</w:t>
-      </w:r>
-    </w:p>
-    <w:p>
-      <w:pPr>
         <w:spacing w:after="120" w:line="276"/>
       </w:pPr>
       <w:r>
@@ -3195,14 +3115,6 @@
     </w:p>
     <w:p>
       <w:pPr>
-        <w:pStyle w:val="Heading2"/>
-      </w:pPr>
-      <w:r>
-        <w:t xml:space="preserve">6.2 Una memoria que no miente</w:t>
-      </w:r>
-    </w:p>
-    <w:p>
-      <w:pPr>
         <w:spacing w:after="120" w:line="276"/>
       </w:pPr>
       <w:r>
@@ -3211,26 +3123,10 @@
     </w:p>
     <w:p>
       <w:pPr>
-        <w:pStyle w:val="Heading2"/>
-      </w:pPr>
-      <w:r>
-        <w:t xml:space="preserve">6.3 Umbrales que se vigilan solos</w:t>
-      </w:r>
-    </w:p>
-    <w:p>
-      <w:pPr>
         <w:spacing w:after="120" w:line="276"/>
       </w:pPr>
       <w:r>
         <w:t xml:space="preserve">En cada arranque, el nodo comprueba que sus umbrales de alarma tienen valores creíbles. Si encuentra algo absurdo, recupera los valores de fábrica y baja la alarma. Esto se añadió después de que un umbral corrompido dejara un nodo atrapado en alarma de incendio durante horas, sin forma de salir.</w:t>
-      </w:r>
-    </w:p>
-    <w:p>
-      <w:pPr>
-        <w:pStyle w:val="Heading2"/>
-      </w:pPr>
-      <w:r>
-        <w:t xml:space="preserve">6.4 Cuando la batería se agota</w:t>
       </w:r>
     </w:p>
     <w:p>
@@ -3280,14 +3176,6 @@
     </w:p>
     <w:p>
       <w:pPr>
-        <w:pStyle w:val="Heading2"/>
-      </w:pPr>
-      <w:r>
-        <w:t xml:space="preserve">7.1 Escuchar a los nodos</w:t>
-      </w:r>
-    </w:p>
-    <w:p>
-      <w:pPr>
         <w:spacing w:after="120" w:line="276"/>
       </w:pPr>
       <w:r>
@@ -3312,14 +3200,6 @@
     </w:p>
     <w:p>
       <w:pPr>
-        <w:pStyle w:val="Heading2"/>
-      </w:pPr>
-      <w:r>
-        <w:t xml:space="preserve">7.2 El módem</w:t>
-      </w:r>
-    </w:p>
-    <w:p>
-      <w:pPr>
         <w:spacing w:after="120" w:line="276"/>
       </w:pPr>
       <w:r>
@@ -3344,14 +3224,6 @@
     </w:p>
     <w:p>
       <w:pPr>
-        <w:pStyle w:val="Heading2"/>
-      </w:pPr>
-      <w:r>
-        <w:t xml:space="preserve">7.3 Subir los datos al servidor</w:t>
-      </w:r>
-    </w:p>
-    <w:p>
-      <w:pPr>
         <w:spacing w:after="120" w:line="276"/>
       </w:pPr>
       <w:r>
@@ -3360,26 +3232,10 @@
     </w:p>
     <w:p>
       <w:pPr>
-        <w:pStyle w:val="Heading2"/>
-      </w:pPr>
-      <w:r>
-        <w:t xml:space="preserve">7.4 Llevar las órdenes a los nodos</w:t>
-      </w:r>
-    </w:p>
-    <w:p>
-      <w:pPr>
         <w:spacing w:after="120" w:line="276"/>
       </w:pPr>
       <w:r>
         <w:t xml:space="preserve">Las órdenes del servidor llegan casi siempre cuando el nodo está dormido, así que la pasarela las organiza en una pequeña lista de espera de seis huecos. Si llega una orden nueva sobre el mismo ajuste del mismo nodo, sustituye a la anterior, porque lo que vale es lo último que pidió el operador. La orden se entrega en la siguiente ventana de escucha del nodo; si el nodo no confirma, se vuelve a intentar en la siguiente. Al final, el resultado —confirmada, rechazada o caducada— se publica en el servidor, en tres sitios distintos para que se vea tanto si se mira la pasarela como si se mira el nodo.</w:t>
-      </w:r>
-    </w:p>
-    <w:p>
-      <w:pPr>
-        <w:pStyle w:val="Heading2"/>
-      </w:pPr>
-      <w:r>
-        <w:t xml:space="preserve">7.5 La pantalla y la página web</w:t>
       </w:r>
     </w:p>
     <w:p>
@@ -4494,7 +4350,7 @@
         <w:t xml:space="preserve">Cálculos de batería antiguos. </w:t>
       </w:r>
       <w:r>
-        <w:t xml:space="preserve">Como decíamos en 6.4, todo lo relacionado con la batería se calculó para supercondensadores y no para el litio que se usa ahora.</w:t>
+        <w:t xml:space="preserve">Como contábamos en el capítulo 6, todo lo relacionado con la batería se calculó para supercondensadores y no para el litio que se usa ahora.</w:t>
       </w:r>
     </w:p>
     <w:p>
@@ -4600,10 +4456,10 @@
     </w:p>
     <w:p>
       <w:pPr>
-        <w:pStyle w:val="Heading2"/>
-      </w:pPr>
-      <w:r>
-        <w:t xml:space="preserve">Pequeño glosario</w:t>
+        <w:spacing w:after="120" w:line="276"/>
+      </w:pPr>
+      <w:r>
+        <w:t xml:space="preserve">Y para terminar, un pequeño glosario con las palabras que más se repiten:</w:t>
       </w:r>
     </w:p>
     <w:tbl>

</xml_diff>